<commit_message>
arreglo otro si rodamiento
</commit_message>
<xml_diff>
--- a/webapp/templates/word/Otro_Si_Rodamiento.docx
+++ b/webapp/templates/word/Otro_Si_Rodamiento.docx
@@ -131,135 +131,102 @@
         </w:rPr>
         <w:t>No.</w:t>
       </w:r>
+      <w:r>
+        <w:rPr>
+          <w:rFonts w:ascii="Arial" w:eastAsia="Arial" w:hAnsi="Arial" w:cs="Arial"/>
+        </w:rPr>
+        <w:t xml:space="preserve"> </w:t>
+      </w:r>
+      <w:r>
+        <w:rPr>
+          <w:rFonts w:ascii="Arial" w:eastAsia="Arial" w:hAnsi="Arial" w:cs="Arial"/>
+          <w:b/>
+          <w:bCs/>
+        </w:rPr>
+        <w:t>[[Cedula]]</w:t>
+      </w:r>
+      <w:r>
+        <w:rPr>
+          <w:rFonts w:ascii="Arial" w:eastAsia="Arial" w:hAnsi="Arial" w:cs="Arial"/>
+        </w:rPr>
+        <w:t xml:space="preserve"> como aparece al pie de su firma y quien adelante se denominará EL TRABAJADOR, y por la otra, LAURA CRISTINA CERÓN MUÑOZ identificada con la C.C. No. 52.705.312 y quien actúa en representación de DIACO S.A., quien en adelante se denominará EL EMPLEADOR, con el fin de suscribir un acuerdo provisto de las siguientes cláusulas.</w:t>
+      </w:r>
+    </w:p>
+    <w:p>
+      <w:pPr>
+        <w:spacing w:after="0" w:line="240" w:lineRule="auto"/>
+        <w:jc w:val="both"/>
+        <w:rPr>
+          <w:rFonts w:ascii="Arial" w:eastAsia="Arial" w:hAnsi="Arial" w:cs="Arial"/>
+        </w:rPr>
+      </w:pPr>
+    </w:p>
+    <w:p>
+      <w:pPr>
+        <w:spacing w:after="0" w:line="240" w:lineRule="auto"/>
+        <w:jc w:val="both"/>
+        <w:rPr>
+          <w:rFonts w:ascii="Arial" w:eastAsia="Arial" w:hAnsi="Arial" w:cs="Arial"/>
+        </w:rPr>
+      </w:pPr>
+      <w:r>
+        <w:rPr>
+          <w:rFonts w:ascii="Arial" w:eastAsia="Arial" w:hAnsi="Arial" w:cs="Arial"/>
+          <w:b/>
+          <w:bCs/>
+        </w:rPr>
+        <w:t>PRIMERA:</w:t>
+      </w:r>
+      <w:r>
+        <w:rPr>
+          <w:rFonts w:ascii="Arial" w:eastAsia="Arial" w:hAnsi="Arial" w:cs="Arial"/>
+        </w:rPr>
+        <w:t xml:space="preserve"> EL EMPLEADOR por mera liberalidad, en consideración a la necesidad que tiene EL TRABAJADOR de desplazarse a diferentes lugares en virtud del cargo que desempeña, y con el objeto de proporcionar un instrumento que le permita cumplir los fines de su cargo, otorga a EL TRABAJADOR un auxilio de trasporte extralegal.</w:t>
+      </w:r>
+    </w:p>
+    <w:p>
+      <w:pPr>
+        <w:spacing w:after="0" w:line="240" w:lineRule="auto"/>
+        <w:jc w:val="both"/>
+        <w:rPr>
+          <w:rFonts w:ascii="Arial" w:eastAsia="Arial" w:hAnsi="Arial" w:cs="Arial"/>
+        </w:rPr>
+      </w:pPr>
+    </w:p>
+    <w:p>
+      <w:pPr>
+        <w:spacing w:after="0" w:line="240" w:lineRule="auto"/>
+        <w:jc w:val="both"/>
+        <w:rPr>
+          <w:rFonts w:ascii="Arial" w:eastAsia="Arial" w:hAnsi="Arial" w:cs="Arial"/>
+          <w:b/>
+          <w:bCs/>
+        </w:rPr>
+      </w:pPr>
+      <w:r>
+        <w:rPr>
+          <w:rFonts w:ascii="Arial" w:eastAsia="Arial" w:hAnsi="Arial" w:cs="Arial"/>
+        </w:rPr>
+        <w:t xml:space="preserve">En consecuencia, de lo anterior, las partes han convenido que EL TRABAJADOR reciba un valor de </w:t>
+      </w:r>
+      <w:r>
+        <w:rPr>
+          <w:rFonts w:ascii="Arial" w:hAnsi="Arial" w:cs="Arial"/>
+          <w:b/>
+          <w:sz w:val="24"/>
+          <w:szCs w:val="24"/>
+        </w:rPr>
+        <w:t>UN MILLÓN CUATROCIENTOS SETENTA Y UN MIL DOCIENTOS SESENTA Y SIETE PESOS M/CTE ($1.471.267)</w:t>
+      </w:r>
       <w:bookmarkStart w:id="0" w:name="_GoBack"/>
       <w:bookmarkEnd w:id="0"/>
       <w:r>
         <w:rPr>
           <w:rFonts w:ascii="Arial" w:eastAsia="Arial" w:hAnsi="Arial" w:cs="Arial"/>
-        </w:rPr>
-        <w:t xml:space="preserve"> </w:t>
-      </w:r>
-      <w:r>
-        <w:rPr>
-          <w:rFonts w:ascii="Arial" w:eastAsia="Arial" w:hAnsi="Arial" w:cs="Arial"/>
-          <w:b/>
-          <w:bCs/>
-        </w:rPr>
-        <w:t>[[Cedula]]</w:t>
-      </w:r>
-      <w:r>
-        <w:rPr>
-          <w:rFonts w:ascii="Arial" w:eastAsia="Arial" w:hAnsi="Arial" w:cs="Arial"/>
-        </w:rPr>
-        <w:t xml:space="preserve"> como aparece al pie de su firma y quien adelante se denominará EL TRABAJADOR, y por la otra, LAURA CRISTINA CERÓN MUÑOZ identificada con la C.C. No. 52.705.312 y quien actúa en representación de DIACO S.A., quien en adelante se denominará EL EMPLEADOR, con el fin de suscribir un acuerdo provisto de las siguientes cláusulas.</w:t>
-      </w:r>
-    </w:p>
-    <w:p>
-      <w:pPr>
-        <w:spacing w:after="0" w:line="240" w:lineRule="auto"/>
-        <w:jc w:val="both"/>
-        <w:rPr>
-          <w:rFonts w:ascii="Arial" w:eastAsia="Arial" w:hAnsi="Arial" w:cs="Arial"/>
-        </w:rPr>
-      </w:pPr>
-    </w:p>
-    <w:p>
-      <w:pPr>
-        <w:spacing w:after="0" w:line="240" w:lineRule="auto"/>
-        <w:jc w:val="both"/>
-        <w:rPr>
-          <w:rFonts w:ascii="Arial" w:eastAsia="Arial" w:hAnsi="Arial" w:cs="Arial"/>
-        </w:rPr>
-      </w:pPr>
-      <w:r>
-        <w:rPr>
-          <w:rFonts w:ascii="Arial" w:eastAsia="Arial" w:hAnsi="Arial" w:cs="Arial"/>
-          <w:b/>
-          <w:bCs/>
-        </w:rPr>
-        <w:t>PRIMERA:</w:t>
-      </w:r>
-      <w:r>
-        <w:rPr>
-          <w:rFonts w:ascii="Arial" w:eastAsia="Arial" w:hAnsi="Arial" w:cs="Arial"/>
-        </w:rPr>
-        <w:t xml:space="preserve"> EL EMPLEADOR por mera liberalidad, en consideración a la necesidad que tiene EL TRABAJADOR de desplazarse a diferentes lugares en virtud del cargo que desempeña, y con el objeto de proporcionar un instrumento que le permita cumplir los fines de su cargo, otorga a EL TRABAJADOR un auxilio de trasporte extralegal.</w:t>
-      </w:r>
-    </w:p>
-    <w:p>
-      <w:pPr>
-        <w:spacing w:after="0" w:line="240" w:lineRule="auto"/>
-        <w:jc w:val="both"/>
-        <w:rPr>
-          <w:rFonts w:ascii="Arial" w:eastAsia="Arial" w:hAnsi="Arial" w:cs="Arial"/>
-        </w:rPr>
-      </w:pPr>
-    </w:p>
-    <w:p>
-      <w:pPr>
-        <w:spacing w:after="0" w:line="240" w:lineRule="auto"/>
-        <w:jc w:val="both"/>
-        <w:rPr>
-          <w:rFonts w:ascii="Arial" w:eastAsia="Arial" w:hAnsi="Arial" w:cs="Arial"/>
-          <w:b/>
-          <w:bCs/>
-        </w:rPr>
-      </w:pPr>
-      <w:r>
-        <w:rPr>
-          <w:rFonts w:ascii="Arial" w:eastAsia="Arial" w:hAnsi="Arial" w:cs="Arial"/>
-        </w:rPr>
-        <w:t xml:space="preserve">En consecuencia, de lo anterior, las partes han convenido que EL TRABAJADOR reciba un valor de </w:t>
-      </w:r>
-      <w:r>
-        <w:rPr>
-          <w:rFonts w:ascii="Arial" w:eastAsia="Arial" w:hAnsi="Arial" w:cs="Arial"/>
-          <w:b/>
-          <w:bCs/>
-        </w:rPr>
-        <w:t>[[</w:t>
-      </w:r>
-      <w:proofErr w:type="spellStart"/>
-      <w:r>
-        <w:rPr>
-          <w:rFonts w:ascii="Arial" w:eastAsia="Arial" w:hAnsi="Arial" w:cs="Arial"/>
-          <w:b/>
-          <w:bCs/>
-        </w:rPr>
-        <w:t>SalarioLetras</w:t>
-      </w:r>
-      <w:proofErr w:type="spellEnd"/>
-      <w:r>
-        <w:rPr>
-          <w:rFonts w:ascii="Arial" w:eastAsia="Arial" w:hAnsi="Arial" w:cs="Arial"/>
-          <w:b/>
-          <w:bCs/>
-        </w:rPr>
-        <w:t>]]</w:t>
-      </w:r>
-      <w:r>
-        <w:rPr>
-          <w:rFonts w:ascii="Arial" w:eastAsia="Arial" w:hAnsi="Arial" w:cs="Arial"/>
-          <w:b/>
-          <w:bCs/>
-        </w:rPr>
-        <w:t xml:space="preserve"> </w:t>
-      </w:r>
-      <w:r>
-        <w:rPr>
-          <w:rFonts w:ascii="Arial" w:eastAsia="Arial" w:hAnsi="Arial" w:cs="Arial"/>
-          <w:b/>
-          <w:bCs/>
-        </w:rPr>
-        <w:t>([[Salario]]</w:t>
-      </w:r>
-      <w:r>
-        <w:rPr>
-          <w:rFonts w:ascii="Arial" w:eastAsia="Arial" w:hAnsi="Arial" w:cs="Arial"/>
-          <w:b/>
-          <w:bCs/>
-        </w:rPr>
-        <w:t xml:space="preserve">), </w:t>
+          <w:b/>
+          <w:bCs/>
+        </w:rPr>
+        <w:t xml:space="preserve">, </w:t>
       </w:r>
       <w:r>
         <w:rPr>

</xml_diff>